<commit_message>
Fix Health Policy STROBE table references and cover letter sensitivity count
- STROBE: only detect Table 1/Table 2 and inline Figure 1/Figure 2; remove Table 3/Figure Legends refs
- STROBE: point 14(b) missing-data n to Table 1; point 16(a) main results to Table 2; point 16(b) to Figure 1 & Figure 2
- Cover letter: 'three pre-specified sensitivity analyses' -> 'four' to match the manuscript
- Rebuild Health Policy submission package

Co-Authored-By: Tatsuki Onishi <bougtoir@gmail.com>
</commit_message>
<xml_diff>
--- a/documents/Health_Policy/STROBE_checklist_Health_Policy_EN.docx
+++ b/documents/Health_Policy/STROBE_checklist_Health_Policy_EN.docx
@@ -1884,7 +1884,7 @@
               <w:rPr>
                 <w:sz w:val="18"/>
               </w:rPr>
-              <w:t>Table 2 column 'n'</w:t>
+              <w:t>Table 1 column 'n'</w:t>
             </w:r>
           </w:p>
         </w:tc>
@@ -1898,7 +1898,7 @@
               <w:rPr>
                 <w:sz w:val="18"/>
               </w:rPr>
-              <w:t>10</w:t>
+              <w:t>8</w:t>
             </w:r>
           </w:p>
         </w:tc>
@@ -2028,7 +2028,7 @@
               <w:rPr>
                 <w:sz w:val="18"/>
               </w:rPr>
-              <w:t>Results, '3.2 Multilevel model and university hospital effect'; Table 3 (mixed-effects coefficients with 95% confidence intervals)</w:t>
+              <w:t>Results, '3.2 Multilevel model and university hospital effect'; Table 2 (mixed-effects coefficients with 95% confidence intervals)</w:t>
             </w:r>
           </w:p>
         </w:tc>
@@ -2042,6 +2042,7 @@
               <w:rPr>
                 <w:sz w:val="18"/>
               </w:rPr>
+              <w:t>10</w:t>
             </w:r>
           </w:p>
         </w:tc>
@@ -2098,7 +2099,7 @@
               <w:rPr>
                 <w:sz w:val="18"/>
               </w:rPr>
-              <w:t>Figure 1 and Figure 2 legends (quintile shading)</w:t>
+              <w:t>Figure 1 and Figure 2 (quintile shading)</w:t>
             </w:r>
           </w:p>
         </w:tc>
@@ -2112,6 +2113,7 @@
               <w:rPr>
                 <w:sz w:val="18"/>
               </w:rPr>
+              <w:t>8, 12</w:t>
             </w:r>
           </w:p>
         </w:tc>

</xml_diff>